<commit_message>
Cover fixes: full-bleed image, bigger subtitle, remove page-count tag
Cover image:
- Subtitle bumped from 44pt to 68pt (significantly larger)
- Subtitle now splits across 4 lines for better balance at larger size
- Removed FIELD MANUAL // 117 PAGES // 47 TACTICS tag entirely
  (page count was wrong and the tag was unnecessary)

Docx structure:
- Cover page is now its own section with ZERO margins so the
  cream-background image fills the entire 6x9 page edge to edge
  (previously the image sat inside body margins leaving white bars)
- Body starts in section 2 with normal margins, header, footer
- Explicitly unlinked body section's header/footer from cover
  section so they don't inherit backwards
- Cover has no header, no footer, no page number
</commit_message>
<xml_diff>
--- a/funnel/exports/shadow-persuasion.docx
+++ b/funnel/exports/shadow-persuasion.docx
@@ -4,13 +4,14 @@
   <w:body>
     <w:p>
       <w:pPr>
-        <w:spacing w:before="0" w:after="0"/>
-        <w:jc w:val="center"/>
+        <w:spacing w:before="0" w:after="0" w:line="240" w:lineRule="auto"/>
+        <w:ind w:left="0" w:right="0" w:firstLine="0"/>
+        <w:jc w:val="left"/>
       </w:pPr>
       <w:r>
         <w:drawing>
           <wp:inline xmlns:a="http://schemas.openxmlformats.org/drawingml/2006/main" xmlns:pic="http://schemas.openxmlformats.org/drawingml/2006/picture">
-            <wp:extent cx="5943600" cy="8915400"/>
+            <wp:extent cx="5486400" cy="8229600"/>
             <wp:docPr id="1" name="Picture 1"/>
             <wp:cNvGraphicFramePr>
               <a:graphicFrameLocks noChangeAspect="1"/>
@@ -31,7 +32,7 @@
                   <pic:spPr>
                     <a:xfrm>
                       <a:off x="0" y="0"/>
-                      <a:ext cx="5943600" cy="8915400"/>
+                      <a:ext cx="5486400" cy="8229600"/>
                     </a:xfrm>
                     <a:prstGeom prst="rect"/>
                   </pic:spPr>
@@ -44,11 +45,13 @@
     </w:p>
     <w:p>
       <w:pPr>
-        <w:spacing w:after="0"/>
-      </w:pPr>
-      <w:r>
-        <w:br w:type="page"/>
-      </w:r>
+        <w:sectPr>
+          <w:pgSz w:w="8640" w:h="12960"/>
+          <w:pgMar w:top="0" w:right="0" w:bottom="0" w:left="0" w:header="0" w:footer="0" w:gutter="0"/>
+          <w:cols w:space="720"/>
+          <w:docGrid w:linePitch="360"/>
+        </w:sectPr>
+      </w:pPr>
     </w:p>
     <w:p>
       <w:pPr>
@@ -16726,7 +16729,6 @@
       <w:pgSz w:w="8640" w:h="12960"/>
       <w:pgMar w:top="1584" w:right="1080" w:bottom="1296" w:left="1080" w:header="432" w:footer="576" w:gutter="0"/>
       <w:cols w:space="720"/>
-      <w:titlePg/>
       <w:docGrid w:linePitch="360"/>
     </w:sectPr>
   </w:body>

</xml_diff>